<commit_message>
redis and bot scoring prediction
</commit_message>
<xml_diff>
--- a/docs/project_report.docx
+++ b/docs/project_report.docx
@@ -1625,6 +1625,16 @@
       </w:r>
     </w:p>
     <w:p>
+      <w:r>
+        <w:t>That compensation path is the failure-mode half of the trade-off. The steady-state half was directly observed during verification, and it is the more concrete example: /sales/{sale_id} does not reflect Redis-path purchases, because reserved_stock lives only in PostgreSQL — this divergence is the AP-vs-CP trade-off in practice, not a defect. Observed against the canonical demo sale: a successful POST to /checkout/redis returned HTTP 200 with a durable order_id, and the Redis counter moved from 5 to 4, but inventory.reserved_stock was never touched, so a subsequent GET /sales/{sale_id} still reported available = 5. Two stores, two different answers, by design.</w:t>
+      </w:r>
+    </w:p>
+    <w:p>
+      <w:r>
+        <w:t>This is the same two-tier split seen from the read side. Redis owns stock on the hot path and is tuned for availability and partition tolerance; PostgreSQL owns the durable Order record and is tuned for consistency, so no order is ever double-fulfilled. The price of applying a different CAP position to each responsibility is exactly the divergence above. Reconciling the two counters -- a background job replaying Redis decrements into reserved_stock, or folding the SQL write into the same unit of work -- is deliberately out of scope for the fast path, because doing it synchronously would reintroduce the PostgreSQL round-trip that the fast path exists to avoid. The pessimistic and optimistic strategies in Section 8.2 are the strongly-consistent alternatives, and the three-way benchmark table is what that consistency costs in throughput. The behaviour is commented as intentional at both call sites (/checkout/redis in app/main.py and app/demos/demo_4_redis_atomic.py) so that it is not mistaken for a missing UPDATE.</w:t>
+      </w:r>
+    </w:p>
+    <w:p>
       <w:pPr>
         <w:pStyle w:val="Heading1"/>
       </w:pPr>

</xml_diff>